<commit_message>
Rewrite the abstract for a quick read (Fable 5.1 second opinion)
Fewer numbers (digits 82 -> 35), adds the objective-not-data finding,
keeps every claim and the main text within 8 pages.

Co-Authored-By: Claude Opus 5.5 <noreply@anthropic.com>
</commit_message>
<xml_diff>
--- a/report/submission.docx
+++ b/report/submission.docx
@@ -381,14 +381,13 @@
                 </w:tcPr>
                 <w:p>
                   <w:pPr>
-                    <w:spacing w:before="0" w:after="120" w:line="240" w:lineRule="auto"/>
-                    <w:jc w:val="both"/>
+                    <w:spacing w:before="0" w:after="120" w:line="250" w:lineRule="auto"/>
                   </w:pPr>
                   <w:r>
                     <w:rPr>
                       <w:rFonts w:ascii="Arial" w:cs="Arial" w:eastAsia="Arial" w:hAnsi="Arial"/>
                     </w:rPr>
-                    <w:t xml:space="preserve">Shared pricing software can align competitors' prices without any agreement, the theory of the US case against RealPage. Its 2026 Final Judgment limits what the software may see (no current rival data) and do (auto-accept only within user-set parameters). We test these remedies on an LLM pricing hub told to maximise its clients' combined profit, in a repeated logit Bertrand duopoly (more than 700 runs; seven models from six labs; pre-registered main batch). With Claude Haiku 5.5 the hub raises profit gain Δ (1 = joint monopoly) from 0.06 to 0.99 (n = 20 per arm). Each remedy's effect depends on the model. A data ban removes 69–92% of the harm for Haiku, Qwen3.8 Flash and Nemotron 3.5 Lightning, but at most 10% for DeepSeek V4.1 Flash and Gemini 3.5 Flash-Lite. Auto-accept within ±1–3% per round retains 88–101% of it and only delays monopoly (Haiku, Qwen). Firm discretion removes 95% for Haiku (holding over 200 rounds) and ~100% for Qwen, but 57% for Gemini Flash-Lite (95% CI 27–84; n = 12) and none when its firms think (n = 6). Discretion fails against a ratchet of small steps: a scripted recommender adding 1 cent per round gives Δ 0.05 with Haiku firms, 0.28 with Nemotron, 0.73 with Qwen and 0.93–1.00 with GPT-5.4 mini and Gemini Flash-Lite, rising with how often each accepts 1–2-cent nudges (12% to 72%). Remedies should constrain the advisor's objective and audit acceptance and outcomes; our open harness lets a court-appointed monitor run that test on a vendor's model.</w:t>
+                    <w:t xml:space="preserve">Shared pricing software can align competitors' prices without any agreement, the theory of the US case against RealPage. Its 2026 Final Judgment bans current rival data, limits auto-acceptance to user-set parameters and protects users' overrides. We test these remedies on an LLM pricing hub advising both firms in a repeated Bertrand duopoly, instructed to maximise their combined profit (RealPage's alleged incentive). Across 700+ runs on seven models from six labs (main batch pre-registered), the hub raises profit gain (0 = competitive, 1 = joint monopoly) from 0.06 to 0.99 on Claude Haiku 5.5. With a per-client objective and the same rival data it is pro-competitive: the objective, not the data, does the harm. Remedies are model-dependent. A data ban removes most of the harm (69–92%) on three models and almost none on two. Auto-accept bands of ±1–3% per round only delay monopoly (Haiku, Qwen). Firm discretion removes 95% or more for Haiku and Qwen, about half for Gemini Flash-Lite, and none when its firms think. Discretion fails against a ratchet: a scripted recommender adding one cent a round yields profit gains from 0.05 to 1.00 across five firm models, rising with how often each accepts small nudges (12–72%). A monitor of single price moves rates these small-step climbs as less suspicious than honest play. Remedies should constrain and audit the advisor's objective, track how often users accept small increases, and judge where prices settle, not single steps. Our open harness lets a court-appointed monitor test a vendor's model.</w:t>
                   </w:r>
                 </w:p>
               </w:tc>

</xml_diff>

<commit_message>
Fact-check fixes: setup descriptions now match the code; crisp 2x architecture GIF
13 wording/detail fixes from a read-only audit against advisor/*.py (no result
numbers changed); Figure 1 regenerated with GPT-5.4 mini at n = 5; PDF rebuilt
(main text still within 8 pages).

Co-Authored-By: Claude Opus 5.5 <noreply@anthropic.com>
</commit_message>
<xml_diff>
--- a/report/submission.docx
+++ b/report/submission.docx
@@ -758,7 +758,7 @@
         <w:rPr>
           <w:rFonts w:ascii="Arial" w:cs="Arial" w:eastAsia="Arial" w:hAnsi="Arial"/>
         </w:rPr>
-        <w:t xml:space="preserve"> A logit Bertrand duopoly with Calvano et al.'s (2020) parameters (a = 2, μ = 0.25, c = 1), with Nash price p_N = 1.473 and joint-monopoly price p_M = 1.925. Every run starts from 10 rounds of competitive history (Nash ± 5 cents).</w:t>
+        <w:t xml:space="preserve"> A logit Bertrand duopoly with Calvano et al.'s (2020) parameters (a = 2, μ = 0.25, c = 1), with Nash price p_N = 1.473 and joint-monopoly price p_M = 1.925. Every run starts from 10 rounds of competitive history (prices drawn from 5 cents below to 6 cents above Nash).</w:t>
       </w:r>
     </w:p>
     <w:p>
@@ -825,7 +825,7 @@
         <w:rPr>
           <w:rFonts w:ascii="Arial" w:cs="Arial" w:eastAsia="Arial" w:hAnsi="Arial"/>
         </w:rPr>
-        <w:t xml:space="preserve"> Firms use the P0 prompt of Fish et al. (2024), via llm-cartel, plus one sentence: the firm competes with one other firm whose prices and sales it does not observe. They see their own price, quantity and profit history, plus the software's recommendations when advised (Appendix A).</w:t>
+        <w:t xml:space="preserve"> Firms use the P0 prompt of Fish et al. (2024), via llm-cartel, plus a one-line request for a stated reason and one sentence: the firm competes with one other firm whose prices and sales it does not observe. They see their own price, quantity and profit history, plus the software's recommendations when advised (Appendix A).</w:t>
       </w:r>
     </w:p>
     <w:p>
@@ -948,7 +948,7 @@
         <w:rPr>
           <w:rFonts w:ascii="Arial" w:cs="Arial" w:eastAsia="Arial" w:hAnsi="Arial"/>
         </w:rPr>
-        <w:t xml:space="preserve">, the decree's data ban), or a market average (</w:t>
+        <w:t xml:space="preserve">, the decree's data ban), or the rivals' average price and total quantity (</w:t>
       </w:r>
       <w:r>
         <w:rPr>
@@ -1338,7 +1338,7 @@
         <w:rPr>
           <w:rFonts w:ascii="Arial" w:cs="Arial" w:eastAsia="Arial" w:hAnsi="Arial"/>
         </w:rPr>
-        <w:t xml:space="preserve"> Profit gain Δ over the last 20 of 100 rounds, for Claude Haiku 5.5 (n = 20 per arm) and DeepSeek V4.1 Flash (n = 3–8). Dots are runs; bars are 95% t-intervals.</w:t>
+        <w:t xml:space="preserve"> Profit gain Δ over the last 20 of 100 rounds, for Claude Haiku 5.5 (n = 20 per arm), DeepSeek V4.1 Flash (n = 3–8) and GPT-5.4 mini (n = 5). Grey dots are Haiku runs; bars are 95% t-intervals.</w:t>
       </w:r>
     </w:p>
     <w:p>
@@ -1994,7 +1994,7 @@
         <w:rPr>
           <w:rFonts w:ascii="Arial" w:cs="Arial" w:eastAsia="Arial" w:hAnsi="Arial"/>
         </w:rPr>
-        <w:t xml:space="preserve"> A scripted joint-profit hub reaches Δ 1.00 with current or stale data, and 0.82 with none (price index 0.60, the dashed line in Figure 2). Under a joint objective, raising one's own price is profitable even without information about the rival.</w:t>
+        <w:t xml:space="preserve"> A scripted hub that maximises this round's combined profit reaches Δ 1.00 with current or stale data, and 0.82 with none, where it assumes the rival stays at Nash (price index 0.60, the dashed line in Figure 2). Under a joint objective, raising one's own price is profitable even without information about the rival.</w:t>
       </w:r>
     </w:p>
     <w:p>
@@ -3564,7 +3564,7 @@
         <w:rPr>
           <w:rFonts w:ascii="Arial" w:cs="Arial" w:eastAsia="Arial" w:hAnsi="Arial"/>
         </w:rPr>
-        <w:t xml:space="preserve"> a one-step jump to p_M, on Haiku, gives Δ 0.07 (n = 5). The +1 cent ratchet on auto-accept gives Δ 1.00 (n = 10).</w:t>
+        <w:t xml:space="preserve"> recommending p_M every round (a one-step jump), on Haiku, gives Δ 0.07 (n = 5). The +1 cent ratchet on auto-accept gives Δ 1.00 (n = 10).</w:t>
       </w:r>
     </w:p>
     <w:p>
@@ -3693,7 +3693,7 @@
         <w:rPr>
           <w:rFonts w:ascii="Arial" w:cs="Arial" w:eastAsia="Arial" w:hAnsi="Arial"/>
         </w:rPr>
-        <w:t xml:space="preserve"> They reach p_M at the pace of the step (Figure 3a).</w:t>
+        <w:t xml:space="preserve"> They reach p_M at the pace of the step (Figure 3).</w:t>
       </w:r>
     </w:p>
     <w:p>
@@ -3793,7 +3793,7 @@
         <w:rPr>
           <w:rFonts w:ascii="Arial" w:cs="Arial" w:eastAsia="Arial" w:hAnsi="Arial"/>
         </w:rPr>
-        <w:t xml:space="preserve"> on Gemini Flash-Lite: stacking the data ban on discretion, and showing the firm the cumulative drift (Table F5).</w:t>
+        <w:t xml:space="preserve"> on Gemini Flash-Lite: stacking the data ban on discretion, and telling the firm how far the recommendation is from its own price 10 rounds earlier (Table F5).</w:t>
       </w:r>
     </w:p>
     <w:p>
@@ -3947,7 +3947,7 @@
         <w:rPr>
           <w:rFonts w:ascii="Arial" w:cs="Arial" w:eastAsia="Arial" w:hAnsi="Arial"/>
         </w:rPr>
-        <w:t xml:space="preserve"> The ratchet lives inside the band: a per-round limit bounds each step, not where the steps lead. On Haiku a ±1% band delayed monopoly by about 15 rounds and changed nothing else. On Qwen a ±3% band retained 88% of the harm.</w:t>
+        <w:t xml:space="preserve"> Under a band the hub's climb becomes a ratchet: a per-round limit bounds each step, not where the steps lead. On Haiku a ±1% band delayed monopoly by about 15 rounds and changed nothing else. On Qwen a ±3% band retained 88% of the harm.</w:t>
       </w:r>
     </w:p>
     <w:p>
@@ -3985,7 +3985,7 @@
         <w:rPr>
           <w:rFonts w:ascii="Arial" w:cs="Arial" w:eastAsia="Arial" w:hAnsi="Arial"/>
         </w:rPr>
-        <w:t xml:space="preserve"> Yes. The Final Judgment's monitor sees recommendation logs, so it can compute what we compute: the share of small recommended increases that users accept. Where users accept most small nudges, discretion is nominal. Real-world acceptance (40–50% of leases within 1% of the recommendation, per the DOJ complaint; 80–90% by former employees' accounts) sits where most of the harm remains in our model (Figure A1).</w:t>
+        <w:t xml:space="preserve"> Yes. The Final Judgment's monitor sees recommendation logs, so it can compute what we compute: the share of small recommended increases that users accept. Where users accept most small nudges, discretion is nominal. Former employees' 80–90% acceptance sits where most of the harm remains in our model (Figure A1); the DOJ complaint's 40–50% (leases within 1% of the recommendation) lies below the partial-adherence rates we tested.</w:t>
       </w:r>
     </w:p>
     <w:p>
@@ -4089,7 +4089,7 @@
         <w:rPr>
           <w:rFonts w:ascii="Arial" w:cs="Arial" w:eastAsia="Arial" w:hAnsi="Arial"/>
         </w:rPr>
-        <w:t xml:space="preserve"> (Table F6). It ranks the hub's guardrailed, ratcheting and discretionary climbs as </w:t>
+        <w:t xml:space="preserve"> (Table F6). It ranks the guardrailed and discretionary hubs' climbs, and the scripted ratchet's, as </w:t>
       </w:r>
       <w:r>
         <w:rPr>
@@ -7416,7 +7416,7 @@
         <w:rPr>
           <w:rFonts w:ascii="Arial" w:cs="Arial" w:eastAsia="Arial" w:hAnsi="Arial"/>
         </w:rPr>
-        <w:t xml:space="preserve">The firm's system prompt is llm-cartel's P0 (Fish et al., 2024), used verbatim. The history-table format follows the starter code's </w:t>
+        <w:t xml:space="preserve">The firm's system prompt is llm-cartel's P0 (Fish et al., 2024) verbatim, plus a one-line request for a stated reason. The history-table format follows the starter code's </w:t>
       </w:r>
       <w:r>
         <w:rPr>
@@ -7859,7 +7859,7 @@
                 <w:sz w:val="18"/>
                 <w:szCs w:val="18"/>
               </w:rPr>
-              <w:t xml:space="preserve">A market-wide average over two symmetric rivals, in a three-firm market</w:t>
+              <w:t xml:space="preserve">The two rivals' average price and total quantity, in a three-firm market</w:t>
             </w:r>
           </w:p>
         </w:tc>
@@ -8648,7 +8648,7 @@
         <w:rPr>
           <w:rFonts w:ascii="Arial" w:cs="Arial" w:eastAsia="Arial" w:hAnsi="Arial"/>
         </w:rPr>
-        <w:t xml:space="preserve"> We use one firm prompt (P0 from Fish et al. 2024, plus one neutral sentence about the competitor) and one advisor prompt per objective. LLM pricing is known to be sensitive to prompts.</w:t>
+        <w:t xml:space="preserve"> We use one firm prompt (P0 from Fish et al. 2024, plus a one-line reason request and one neutral sentence about the competitor) and one advisor prompt per objective. LLM pricing is known to be sensitive to prompts.</w:t>
       </w:r>
     </w:p>
     <w:p>
@@ -9869,7 +9869,7 @@
         <w:rPr>
           <w:rFonts w:ascii="Arial" w:cs="Arial" w:eastAsia="Arial" w:hAnsi="Arial"/>
         </w:rPr>
-        <w:t xml:space="preserve">The share of recommended increases (recommendation minus the firm's last price) that the firm matched exactly, pooled over all finished discretionary runs with the market-aligned hub (</w:t>
+        <w:t xml:space="preserve">The share of recommended increases (recommendation minus the firm's last price) that the firm matched exactly, pooled over every decision a firm made after seeing the market-aligned hub's recommendation: discretionary runs plus, for Haiku, the partial-adherence rounds that were not auto-accepted (</w:t>
       </w:r>
       <w:r>
         <w:rPr>
@@ -10460,11 +10460,11 @@
         </w:tblCellMar>
       </w:tblPr>
       <w:tblGrid>
-        <w:gridCol w:w="4864"/>
-        <w:gridCol w:w="709"/>
-        <w:gridCol w:w="1723"/>
-        <w:gridCol w:w="947"/>
-        <w:gridCol w:w="1117"/>
+        <w:gridCol w:w="3894"/>
+        <w:gridCol w:w="568"/>
+        <w:gridCol w:w="3245"/>
+        <w:gridCol w:w="758"/>
+        <w:gridCol w:w="895"/>
       </w:tblGrid>
       <w:tr>
         <w:trPr>
@@ -10473,7 +10473,7 @@
         </w:trPr>
         <w:tc>
           <w:tcPr>
-            <w:tcW w:w="4864" w:type="dxa"/>
+            <w:tcW w:w="3894" w:type="dxa"/>
             <w:shd w:val="clear" w:color="auto" w:fill="F2F2F2"/>
           </w:tcPr>
           <w:p>
@@ -10494,7 +10494,7 @@
         </w:tc>
         <w:tc>
           <w:tcPr>
-            <w:tcW w:w="709" w:type="dxa"/>
+            <w:tcW w:w="568" w:type="dxa"/>
             <w:shd w:val="clear" w:color="auto" w:fill="F2F2F2"/>
           </w:tcPr>
           <w:p>
@@ -10515,7 +10515,7 @@
         </w:tc>
         <w:tc>
           <w:tcPr>
-            <w:tcW w:w="1723" w:type="dxa"/>
+            <w:tcW w:w="3245" w:type="dxa"/>
             <w:shd w:val="clear" w:color="auto" w:fill="F2F2F2"/>
           </w:tcPr>
           <w:p>
@@ -10536,7 +10536,7 @@
         </w:tc>
         <w:tc>
           <w:tcPr>
-            <w:tcW w:w="947" w:type="dxa"/>
+            <w:tcW w:w="758" w:type="dxa"/>
             <w:shd w:val="clear" w:color="auto" w:fill="F2F2F2"/>
           </w:tcPr>
           <w:p>
@@ -10557,7 +10557,7 @@
         </w:tc>
         <w:tc>
           <w:tcPr>
-            <w:tcW w:w="1117" w:type="dxa"/>
+            <w:tcW w:w="895" w:type="dxa"/>
             <w:shd w:val="clear" w:color="auto" w:fill="F2F2F2"/>
           </w:tcPr>
           <w:p>
@@ -10583,7 +10583,7 @@
         </w:trPr>
         <w:tc>
           <w:tcPr>
-            <w:tcW w:w="4864" w:type="dxa"/>
+            <w:tcW w:w="3894" w:type="dxa"/>
           </w:tcPr>
           <w:p>
             <w:pPr>
@@ -10601,7 +10601,7 @@
         </w:tc>
         <w:tc>
           <w:tcPr>
-            <w:tcW w:w="709" w:type="dxa"/>
+            <w:tcW w:w="568" w:type="dxa"/>
           </w:tcPr>
           <w:p>
             <w:pPr>
@@ -10619,7 +10619,7 @@
         </w:tc>
         <w:tc>
           <w:tcPr>
-            <w:tcW w:w="1723" w:type="dxa"/>
+            <w:tcW w:w="3245" w:type="dxa"/>
           </w:tcPr>
           <w:p>
             <w:pPr>
@@ -10637,7 +10637,7 @@
         </w:tc>
         <w:tc>
           <w:tcPr>
-            <w:tcW w:w="947" w:type="dxa"/>
+            <w:tcW w:w="758" w:type="dxa"/>
           </w:tcPr>
           <w:p>
             <w:pPr>
@@ -10655,7 +10655,7 @@
         </w:tc>
         <w:tc>
           <w:tcPr>
-            <w:tcW w:w="1117" w:type="dxa"/>
+            <w:tcW w:w="895" w:type="dxa"/>
           </w:tcPr>
           <w:p>
             <w:pPr>
@@ -10678,7 +10678,7 @@
         </w:trPr>
         <w:tc>
           <w:tcPr>
-            <w:tcW w:w="4864" w:type="dxa"/>
+            <w:tcW w:w="3894" w:type="dxa"/>
           </w:tcPr>
           <w:p>
             <w:pPr>
@@ -10696,7 +10696,7 @@
         </w:tc>
         <w:tc>
           <w:tcPr>
-            <w:tcW w:w="709" w:type="dxa"/>
+            <w:tcW w:w="568" w:type="dxa"/>
           </w:tcPr>
           <w:p>
             <w:pPr>
@@ -10714,7 +10714,7 @@
         </w:tc>
         <w:tc>
           <w:tcPr>
-            <w:tcW w:w="1723" w:type="dxa"/>
+            <w:tcW w:w="3245" w:type="dxa"/>
           </w:tcPr>
           <w:p>
             <w:pPr>
@@ -10732,7 +10732,7 @@
         </w:tc>
         <w:tc>
           <w:tcPr>
-            <w:tcW w:w="947" w:type="dxa"/>
+            <w:tcW w:w="758" w:type="dxa"/>
           </w:tcPr>
           <w:p>
             <w:pPr>
@@ -10750,7 +10750,7 @@
         </w:tc>
         <w:tc>
           <w:tcPr>
-            <w:tcW w:w="1117" w:type="dxa"/>
+            <w:tcW w:w="895" w:type="dxa"/>
           </w:tcPr>
           <w:p>
             <w:pPr>
@@ -10773,7 +10773,7 @@
         </w:trPr>
         <w:tc>
           <w:tcPr>
-            <w:tcW w:w="4864" w:type="dxa"/>
+            <w:tcW w:w="3894" w:type="dxa"/>
           </w:tcPr>
           <w:p>
             <w:pPr>
@@ -10791,7 +10791,7 @@
         </w:tc>
         <w:tc>
           <w:tcPr>
-            <w:tcW w:w="709" w:type="dxa"/>
+            <w:tcW w:w="568" w:type="dxa"/>
           </w:tcPr>
           <w:p>
             <w:pPr>
@@ -10809,7 +10809,7 @@
         </w:tc>
         <w:tc>
           <w:tcPr>
-            <w:tcW w:w="1723" w:type="dxa"/>
+            <w:tcW w:w="3245" w:type="dxa"/>
           </w:tcPr>
           <w:p>
             <w:pPr>
@@ -10827,7 +10827,7 @@
         </w:tc>
         <w:tc>
           <w:tcPr>
-            <w:tcW w:w="947" w:type="dxa"/>
+            <w:tcW w:w="758" w:type="dxa"/>
           </w:tcPr>
           <w:p>
             <w:pPr>
@@ -10845,7 +10845,7 @@
         </w:tc>
         <w:tc>
           <w:tcPr>
-            <w:tcW w:w="1117" w:type="dxa"/>
+            <w:tcW w:w="895" w:type="dxa"/>
           </w:tcPr>
           <w:p>
             <w:pPr>
@@ -10868,7 +10868,7 @@
         </w:trPr>
         <w:tc>
           <w:tcPr>
-            <w:tcW w:w="4864" w:type="dxa"/>
+            <w:tcW w:w="3894" w:type="dxa"/>
           </w:tcPr>
           <w:p>
             <w:pPr>
@@ -10886,7 +10886,7 @@
         </w:tc>
         <w:tc>
           <w:tcPr>
-            <w:tcW w:w="709" w:type="dxa"/>
+            <w:tcW w:w="568" w:type="dxa"/>
           </w:tcPr>
           <w:p>
             <w:pPr>
@@ -10904,7 +10904,7 @@
         </w:tc>
         <w:tc>
           <w:tcPr>
-            <w:tcW w:w="1723" w:type="dxa"/>
+            <w:tcW w:w="3245" w:type="dxa"/>
           </w:tcPr>
           <w:p>
             <w:pPr>
@@ -10922,7 +10922,7 @@
         </w:tc>
         <w:tc>
           <w:tcPr>
-            <w:tcW w:w="947" w:type="dxa"/>
+            <w:tcW w:w="758" w:type="dxa"/>
           </w:tcPr>
           <w:p>
             <w:pPr>
@@ -10940,7 +10940,7 @@
         </w:tc>
         <w:tc>
           <w:tcPr>
-            <w:tcW w:w="1117" w:type="dxa"/>
+            <w:tcW w:w="895" w:type="dxa"/>
           </w:tcPr>
           <w:p>
             <w:pPr>
@@ -10963,7 +10963,7 @@
         </w:trPr>
         <w:tc>
           <w:tcPr>
-            <w:tcW w:w="4864" w:type="dxa"/>
+            <w:tcW w:w="3894" w:type="dxa"/>
           </w:tcPr>
           <w:p>
             <w:pPr>
@@ -10981,7 +10981,7 @@
         </w:tc>
         <w:tc>
           <w:tcPr>
-            <w:tcW w:w="709" w:type="dxa"/>
+            <w:tcW w:w="568" w:type="dxa"/>
           </w:tcPr>
           <w:p>
             <w:pPr>
@@ -10999,7 +10999,7 @@
         </w:tc>
         <w:tc>
           <w:tcPr>
-            <w:tcW w:w="1723" w:type="dxa"/>
+            <w:tcW w:w="3245" w:type="dxa"/>
           </w:tcPr>
           <w:p>
             <w:pPr>
@@ -11017,7 +11017,7 @@
         </w:tc>
         <w:tc>
           <w:tcPr>
-            <w:tcW w:w="947" w:type="dxa"/>
+            <w:tcW w:w="758" w:type="dxa"/>
           </w:tcPr>
           <w:p>
             <w:pPr>
@@ -11035,7 +11035,7 @@
         </w:tc>
         <w:tc>
           <w:tcPr>
-            <w:tcW w:w="1117" w:type="dxa"/>
+            <w:tcW w:w="895" w:type="dxa"/>
           </w:tcPr>
           <w:p>
             <w:pPr>
@@ -11058,7 +11058,7 @@
         </w:trPr>
         <w:tc>
           <w:tcPr>
-            <w:tcW w:w="4864" w:type="dxa"/>
+            <w:tcW w:w="3894" w:type="dxa"/>
           </w:tcPr>
           <w:p>
             <w:pPr>
@@ -11076,7 +11076,7 @@
         </w:tc>
         <w:tc>
           <w:tcPr>
-            <w:tcW w:w="709" w:type="dxa"/>
+            <w:tcW w:w="568" w:type="dxa"/>
           </w:tcPr>
           <w:p>
             <w:pPr>
@@ -11094,7 +11094,7 @@
         </w:tc>
         <w:tc>
           <w:tcPr>
-            <w:tcW w:w="1723" w:type="dxa"/>
+            <w:tcW w:w="3245" w:type="dxa"/>
           </w:tcPr>
           <w:p>
             <w:pPr>
@@ -11112,7 +11112,7 @@
         </w:tc>
         <w:tc>
           <w:tcPr>
-            <w:tcW w:w="947" w:type="dxa"/>
+            <w:tcW w:w="758" w:type="dxa"/>
           </w:tcPr>
           <w:p>
             <w:pPr>
@@ -11130,7 +11130,7 @@
         </w:tc>
         <w:tc>
           <w:tcPr>
-            <w:tcW w:w="1117" w:type="dxa"/>
+            <w:tcW w:w="895" w:type="dxa"/>
           </w:tcPr>
           <w:p>
             <w:pPr>
@@ -11153,7 +11153,7 @@
         </w:trPr>
         <w:tc>
           <w:tcPr>
-            <w:tcW w:w="4864" w:type="dxa"/>
+            <w:tcW w:w="3894" w:type="dxa"/>
           </w:tcPr>
           <w:p>
             <w:pPr>
@@ -11171,7 +11171,7 @@
         </w:tc>
         <w:tc>
           <w:tcPr>
-            <w:tcW w:w="709" w:type="dxa"/>
+            <w:tcW w:w="568" w:type="dxa"/>
           </w:tcPr>
           <w:p>
             <w:pPr>
@@ -11189,25 +11189,25 @@
         </w:tc>
         <w:tc>
           <w:tcPr>
-            <w:tcW w:w="1723" w:type="dxa"/>
-          </w:tcPr>
-          <w:p>
-            <w:pPr>
-              <w:spacing w:before="0" w:after="0" w:line="240" w:lineRule="auto"/>
-            </w:pPr>
-            <w:r>
-              <w:rPr>
-                <w:rFonts w:ascii="Arial" w:cs="Arial" w:eastAsia="Arial" w:hAnsi="Arial"/>
-                <w:sz w:val="18"/>
-                <w:szCs w:val="18"/>
-              </w:rPr>
-              <w:t xml:space="preserve">0.03 (scripted)</w:t>
-            </w:r>
-          </w:p>
-        </w:tc>
-        <w:tc>
-          <w:tcPr>
-            <w:tcW w:w="947" w:type="dxa"/>
+            <w:tcW w:w="3245" w:type="dxa"/>
+          </w:tcPr>
+          <w:p>
+            <w:pPr>
+              <w:spacing w:before="0" w:after="0" w:line="240" w:lineRule="auto"/>
+            </w:pPr>
+            <w:r>
+              <w:rPr>
+                <w:rFonts w:ascii="Arial" w:cs="Arial" w:eastAsia="Arial" w:hAnsi="Arial"/>
+                <w:sz w:val="18"/>
+                <w:szCs w:val="18"/>
+              </w:rPr>
+              <w:t xml:space="preserve">0.03 (scripted ratchet; no rival data)</w:t>
+            </w:r>
+          </w:p>
+        </w:tc>
+        <w:tc>
+          <w:tcPr>
+            <w:tcW w:w="758" w:type="dxa"/>
           </w:tcPr>
           <w:p>
             <w:pPr>
@@ -11225,7 +11225,7 @@
         </w:tc>
         <w:tc>
           <w:tcPr>
-            <w:tcW w:w="1117" w:type="dxa"/>
+            <w:tcW w:w="895" w:type="dxa"/>
           </w:tcPr>
           <w:p>
             <w:pPr>
@@ -11870,7 +11870,7 @@
                 <w:sz w:val="18"/>
                 <w:szCs w:val="18"/>
               </w:rPr>
-              <w:t xml:space="preserve">Discretion + drift disclosure ("+7.5% compared with your price 10 rounds ago")</w:t>
+              <w:t xml:space="preserve">Discretion + drift disclosure ("That is +7.5% compared with your price of $1.58 10 rounds ago")</w:t>
             </w:r>
           </w:p>
         </w:tc>
@@ -12108,10 +12108,10 @@
         </w:tblCellMar>
       </w:tblPr>
       <w:tblGrid>
-        <w:gridCol w:w="4763"/>
-        <w:gridCol w:w="772"/>
-        <w:gridCol w:w="1982"/>
-        <w:gridCol w:w="1843"/>
+        <w:gridCol w:w="5319"/>
+        <w:gridCol w:w="679"/>
+        <w:gridCol w:w="1742"/>
+        <w:gridCol w:w="1620"/>
       </w:tblGrid>
       <w:tr>
         <w:trPr>
@@ -12120,7 +12120,7 @@
         </w:trPr>
         <w:tc>
           <w:tcPr>
-            <w:tcW w:w="4763" w:type="dxa"/>
+            <w:tcW w:w="5319" w:type="dxa"/>
             <w:shd w:val="clear" w:color="auto" w:fill="F2F2F2"/>
           </w:tcPr>
           <w:p>
@@ -12141,7 +12141,7 @@
         </w:tc>
         <w:tc>
           <w:tcPr>
-            <w:tcW w:w="772" w:type="dxa"/>
+            <w:tcW w:w="679" w:type="dxa"/>
             <w:shd w:val="clear" w:color="auto" w:fill="F2F2F2"/>
           </w:tcPr>
           <w:p>
@@ -12162,7 +12162,7 @@
         </w:tc>
         <w:tc>
           <w:tcPr>
-            <w:tcW w:w="1982" w:type="dxa"/>
+            <w:tcW w:w="1742" w:type="dxa"/>
             <w:shd w:val="clear" w:color="auto" w:fill="F2F2F2"/>
           </w:tcPr>
           <w:p>
@@ -12183,7 +12183,7 @@
         </w:tc>
         <w:tc>
           <w:tcPr>
-            <w:tcW w:w="1843" w:type="dxa"/>
+            <w:tcW w:w="1620" w:type="dxa"/>
             <w:shd w:val="clear" w:color="auto" w:fill="F2F2F2"/>
           </w:tcPr>
           <w:p>
@@ -12209,25 +12209,25 @@
         </w:trPr>
         <w:tc>
           <w:tcPr>
-            <w:tcW w:w="4763" w:type="dxa"/>
-          </w:tcPr>
-          <w:p>
-            <w:pPr>
-              <w:spacing w:before="0" w:after="0" w:line="240" w:lineRule="auto"/>
-            </w:pPr>
-            <w:r>
-              <w:rPr>
-                <w:rFonts w:ascii="Arial" w:cs="Arial" w:eastAsia="Arial" w:hAnsi="Arial"/>
-                <w:sz w:val="18"/>
-                <w:szCs w:val="18"/>
-              </w:rPr>
-              <w:t xml:space="preserve">Auto-accept hub (215)</w:t>
-            </w:r>
-          </w:p>
-        </w:tc>
-        <w:tc>
-          <w:tcPr>
-            <w:tcW w:w="772" w:type="dxa"/>
+            <w:tcW w:w="5319" w:type="dxa"/>
+          </w:tcPr>
+          <w:p>
+            <w:pPr>
+              <w:spacing w:before="0" w:after="0" w:line="240" w:lineRule="auto"/>
+            </w:pPr>
+            <w:r>
+              <w:rPr>
+                <w:rFonts w:ascii="Arial" w:cs="Arial" w:eastAsia="Arial" w:hAnsi="Arial"/>
+                <w:sz w:val="18"/>
+                <w:szCs w:val="18"/>
+              </w:rPr>
+              <w:t xml:space="preserve">Auto-accept hub or scripted recommender (215)</w:t>
+            </w:r>
+          </w:p>
+        </w:tc>
+        <w:tc>
+          <w:tcPr>
+            <w:tcW w:w="679" w:type="dxa"/>
           </w:tcPr>
           <w:p>
             <w:pPr>
@@ -12245,7 +12245,7 @@
         </w:tc>
         <w:tc>
           <w:tcPr>
-            <w:tcW w:w="1982" w:type="dxa"/>
+            <w:tcW w:w="1742" w:type="dxa"/>
           </w:tcPr>
           <w:p>
             <w:pPr>
@@ -12263,7 +12263,7 @@
         </w:tc>
         <w:tc>
           <w:tcPr>
-            <w:tcW w:w="1843" w:type="dxa"/>
+            <w:tcW w:w="1620" w:type="dxa"/>
           </w:tcPr>
           <w:p>
             <w:pPr>
@@ -12286,7 +12286,7 @@
         </w:trPr>
         <w:tc>
           <w:tcPr>
-            <w:tcW w:w="4763" w:type="dxa"/>
+            <w:tcW w:w="5319" w:type="dxa"/>
           </w:tcPr>
           <w:p>
             <w:pPr>
@@ -12304,7 +12304,7 @@
         </w:tc>
         <w:tc>
           <w:tcPr>
-            <w:tcW w:w="772" w:type="dxa"/>
+            <w:tcW w:w="679" w:type="dxa"/>
           </w:tcPr>
           <w:p>
             <w:pPr>
@@ -12322,7 +12322,7 @@
         </w:tc>
         <w:tc>
           <w:tcPr>
-            <w:tcW w:w="1982" w:type="dxa"/>
+            <w:tcW w:w="1742" w:type="dxa"/>
           </w:tcPr>
           <w:p>
             <w:pPr>
@@ -12340,7 +12340,7 @@
         </w:tc>
         <w:tc>
           <w:tcPr>
-            <w:tcW w:w="1843" w:type="dxa"/>
+            <w:tcW w:w="1620" w:type="dxa"/>
           </w:tcPr>
           <w:p>
             <w:pPr>
@@ -12363,7 +12363,7 @@
         </w:trPr>
         <w:tc>
           <w:tcPr>
-            <w:tcW w:w="4763" w:type="dxa"/>
+            <w:tcW w:w="5319" w:type="dxa"/>
           </w:tcPr>
           <w:p>
             <w:pPr>
@@ -12381,7 +12381,7 @@
         </w:tc>
         <w:tc>
           <w:tcPr>
-            <w:tcW w:w="772" w:type="dxa"/>
+            <w:tcW w:w="679" w:type="dxa"/>
           </w:tcPr>
           <w:p>
             <w:pPr>
@@ -12401,7 +12401,7 @@
         </w:tc>
         <w:tc>
           <w:tcPr>
-            <w:tcW w:w="1982" w:type="dxa"/>
+            <w:tcW w:w="1742" w:type="dxa"/>
           </w:tcPr>
           <w:p>
             <w:pPr>
@@ -12419,7 +12419,7 @@
         </w:tc>
         <w:tc>
           <w:tcPr>
-            <w:tcW w:w="1843" w:type="dxa"/>
+            <w:tcW w:w="1620" w:type="dxa"/>
           </w:tcPr>
           <w:p>
             <w:pPr>
@@ -12442,7 +12442,7 @@
         </w:trPr>
         <w:tc>
           <w:tcPr>
-            <w:tcW w:w="4763" w:type="dxa"/>
+            <w:tcW w:w="5319" w:type="dxa"/>
           </w:tcPr>
           <w:p>
             <w:pPr>
@@ -12460,7 +12460,7 @@
         </w:tc>
         <w:tc>
           <w:tcPr>
-            <w:tcW w:w="772" w:type="dxa"/>
+            <w:tcW w:w="679" w:type="dxa"/>
           </w:tcPr>
           <w:p>
             <w:pPr>
@@ -12480,7 +12480,7 @@
         </w:tc>
         <w:tc>
           <w:tcPr>
-            <w:tcW w:w="1982" w:type="dxa"/>
+            <w:tcW w:w="1742" w:type="dxa"/>
           </w:tcPr>
           <w:p>
             <w:pPr>
@@ -12498,7 +12498,7 @@
         </w:tc>
         <w:tc>
           <w:tcPr>
-            <w:tcW w:w="1843" w:type="dxa"/>
+            <w:tcW w:w="1620" w:type="dxa"/>
           </w:tcPr>
           <w:p>
             <w:pPr>
@@ -12521,7 +12521,7 @@
         </w:trPr>
         <w:tc>
           <w:tcPr>
-            <w:tcW w:w="4763" w:type="dxa"/>
+            <w:tcW w:w="5319" w:type="dxa"/>
           </w:tcPr>
           <w:p>
             <w:pPr>
@@ -12539,7 +12539,7 @@
         </w:tc>
         <w:tc>
           <w:tcPr>
-            <w:tcW w:w="772" w:type="dxa"/>
+            <w:tcW w:w="679" w:type="dxa"/>
           </w:tcPr>
           <w:p>
             <w:pPr>
@@ -12559,7 +12559,7 @@
         </w:tc>
         <w:tc>
           <w:tcPr>
-            <w:tcW w:w="1982" w:type="dxa"/>
+            <w:tcW w:w="1742" w:type="dxa"/>
           </w:tcPr>
           <w:p>
             <w:pPr>
@@ -12577,7 +12577,7 @@
         </w:tc>
         <w:tc>
           <w:tcPr>
-            <w:tcW w:w="1843" w:type="dxa"/>
+            <w:tcW w:w="1620" w:type="dxa"/>
           </w:tcPr>
           <w:p>
             <w:pPr>
@@ -12749,7 +12749,7 @@
         <w:rPr>
           <w:rFonts w:ascii="Arial" w:cs="Arial" w:eastAsia="Arial" w:hAnsi="Arial"/>
         </w:rPr>
-        <w:t xml:space="preserve"> Δ by the probability that a firm's price is the hub's recommendation (n = 10–20 per point). The shaded bands mark the acceptance rates reported in the RealPage case.</w:t>
+        <w:t xml:space="preserve"> Δ by the probability q that a firm's price is auto-set to the hub's recommendation; otherwise the firm decides, and sometimes matches anyway (realised follow rates 0.60, 0.83 and 0.92 at q = 0.5, 0.8 and 0.9; n = 10–20 per point). The shaded bands mark the acceptance rates reported in the RealPage case.</w:t>
       </w:r>
     </w:p>
     <w:p>

</xml_diff>